<commit_message>
Update TaxNest agency agreement documentation
Replit-Commit-Author: Agent
</commit_message>
<xml_diff>
--- a/attached_assets/legal/TaxNest-Agency-Agreement.docx
+++ b/attached_assets/legal/TaxNest-Agency-Agreement.docx
@@ -356,6 +356,14 @@
       </w:r>
     </w:p>
     <w:p>
+      <w:pPr>
+        <w:jc w:val="both"/>
+      </w:pPr>
+      <w:r>
+        <w:t>7.3 City carve-out. Where the Territory comprises multiple cities or districts, exclusivity applies city-by-city. If, in any city or district within the Territory, fewer than the per-city minimum stated in Schedule B are achieved over any three (3) consecutive months, the Company may, by written notice, withdraw that city or district from the Agent’s exclusive Territory (without affecting the remainder of the Territory or the Agent’s commission on customers already introduced there).</w:t>
+      </w:r>
+    </w:p>
+    <w:p>
       <w:r>
         <w:rPr>
           <w:b/>
@@ -480,7 +488,7 @@
         <w:jc w:val="both"/>
       </w:pPr>
       <w:r>
-        <w:t>12.1 The Agent shall, on or before signing this Agreement, deposit with the Company a refundable security deposit (the “Deposit”) of: (a) PKR 100,000 (one hundred thousand rupees) in the case of a non-exclusive appointment; or (b) PKR 500,000 (five hundred thousand rupees) where the Agent is granted exclusivity for the Territory under Schedule B. The Deposit shall carry no profit or interest.</w:t>
+        <w:t>12.1 The Agent shall, on or before signing this Agreement, deposit with the Company a refundable security deposit (the “Deposit”) of: (a) PKR 100,000 (one hundred thousand rupees) in the case of a non-exclusive appointment; (b) PKR 500,000 (five hundred thousand rupees) where the Agent is granted exclusivity for a single city or district under Schedule B; or (c) PKR 1,000,000 (one million rupees) where the Agent is granted regional exclusivity covering multiple cities or districts (such as an entire division or region) under Schedule B. The Deposit shall carry no profit or interest.</w:t>
       </w:r>
     </w:p>
     <w:p>
@@ -849,7 +857,7 @@
         <w:jc w:val="both"/>
       </w:pPr>
       <w:r>
-        <w:t>1. Territory: [City / District / Tehsil], Pakistan.</w:t>
+        <w:t>1. Territory: the South Punjab region of Pakistan, comprising the following cities/districts: [Multan, Bahawalpur, Rahim Yar Khan, Dera Ghazi Khan, Muzaffargarh, Vehari, Khanewal, Lodhran, Bahawalnagar, Layyah, Rajanpur, Kot Addu — adjust as agreed].</w:t>
       </w:r>
     </w:p>
     <w:p>
@@ -857,7 +865,7 @@
         <w:jc w:val="both"/>
       </w:pPr>
       <w:r>
-        <w:t>2. Exclusivity: [None / Exclusive for the Territory, conditional on targets].</w:t>
+        <w:t>2. Exclusivity: Exclusive for the Territory, conditional on the Minimum Sales Targets below and subject to the city carve-out in Clause 7.3.</w:t>
       </w:r>
     </w:p>
     <w:p>
@@ -865,7 +873,23 @@
         <w:jc w:val="both"/>
       </w:pPr>
       <w:r>
-        <w:t>3. Minimum Sales Target: at least [5] new paid subscriptions per calendar month, measured monthly and reviewed quarterly.</w:t>
+        <w:t>3. Minimum Sales Target (region-wide): (a) ramp-up period — at least [10] new paid subscriptions per calendar month during the first three (3) months; (b) thereafter — at least [25] new paid subscriptions per calendar month across the Territory, measured monthly and reviewed quarterly.</w:t>
+      </w:r>
+    </w:p>
+    <w:p>
+      <w:pPr>
+        <w:jc w:val="both"/>
+      </w:pPr>
+      <w:r>
+        <w:t>4. Per-city minimum (for the carve-out in Clause 7.3): at least [2] new paid subscriptions per city/district over any rolling three (3) month period, applicable from the fourth month onwards.</w:t>
+      </w:r>
+    </w:p>
+    <w:p>
+      <w:pPr>
+        <w:jc w:val="both"/>
+      </w:pPr>
+      <w:r>
+        <w:t>5. Security Deposit applicable to this appointment: PKR 1,000,000 (regional exclusivity — Clause 12.1(c)).</w:t>
       </w:r>
     </w:p>
     <w:p>

</xml_diff>

<commit_message>
Update agency agreement and refresh mockup components
Replit-Commit-Author: Agent
</commit_message>
<xml_diff>
--- a/attached_assets/legal/TaxNest-Agency-Agreement.docx
+++ b/attached_assets/legal/TaxNest-Agency-Agreement.docx
@@ -857,7 +857,7 @@
         <w:jc w:val="both"/>
       </w:pPr>
       <w:r>
-        <w:t>1. Territory: the South Punjab region of Pakistan, comprising the following cities/districts: [Multan, Bahawalpur, Rahim Yar Khan, Dera Ghazi Khan, Muzaffargarh, Vehari, Khanewal, Lodhran, Bahawalnagar, Layyah, Rajanpur, Kot Addu — adjust as agreed].</w:t>
+        <w:t>1. Territory: the Bahawalpur Division of the Province of Punjab, Pakistan (comprising the districts of Bahawalpur, Bahawalnagar and Rahim Yar Khan), together with Lodhran District.</w:t>
       </w:r>
     </w:p>
     <w:p>
@@ -873,7 +873,7 @@
         <w:jc w:val="both"/>
       </w:pPr>
       <w:r>
-        <w:t>3. Minimum Sales Target (region-wide): (a) ramp-up period — at least [10] new paid subscriptions per calendar month during the first three (3) months; (b) thereafter — at least [25] new paid subscriptions per calendar month across the Territory, measured monthly and reviewed quarterly.</w:t>
+        <w:t>3. Minimum Sales Target (Territory-wide): (a) ramp-up period — at least [8] new paid subscriptions per calendar month during the first three (3) months; (b) thereafter — at least [15] new paid subscriptions per calendar month across the Territory, measured monthly and reviewed quarterly.</w:t>
       </w:r>
     </w:p>
     <w:p>

</xml_diff>